<commit_message>
Bold all revised text and embed 12 supplementary figures with captions and in-text citations
Co-authored-by: joeampon <106930635+joeampon@users.noreply.github.com>
</commit_message>
<xml_diff>
--- a/response to reviewer.docx
+++ b/response to reviewer.docx
@@ -2805,6 +2805,232 @@
           <w:sz w:val="22"/>
         </w:rPr>
         <w:t>Abstract, Novelty section, and throughout.</w:t>
+      </w:r>
+    </w:p>
+    <w:p>
+      <w:r>
+        <w:rPr>
+          <w:rFonts w:ascii="Times New Roman" w:hAnsi="Times New Roman"/>
+          <w:sz w:val="22"/>
+        </w:rPr>
+        <w:t xml:space="preserve"/>
+      </w:r>
+    </w:p>
+    <w:p>
+      <w:r>
+        <w:rPr>
+          <w:rFonts w:ascii="Times New Roman" w:hAnsi="Times New Roman"/>
+          <w:sz w:val="22"/>
+        </w:rPr>
+        <w:t xml:space="preserve">============================================================</w:t>
+      </w:r>
+    </w:p>
+    <w:p>
+      <w:r>
+        <w:rPr>
+          <w:rFonts w:ascii="Times New Roman" w:hAnsi="Times New Roman"/>
+          <w:sz w:val="22"/>
+          <w:b/>
+        </w:rPr>
+        <w:t xml:space="preserve">Additional Note: Figure Embedding</w:t>
+      </w:r>
+    </w:p>
+    <w:p>
+      <w:r>
+        <w:rPr>
+          <w:rFonts w:ascii="Times New Roman" w:hAnsi="Times New Roman"/>
+          <w:sz w:val="22"/>
+        </w:rPr>
+        <w:t xml:space="preserve">============================================================</w:t>
+      </w:r>
+    </w:p>
+    <w:p>
+      <w:r>
+        <w:rPr>
+          <w:rFonts w:ascii="Times New Roman" w:hAnsi="Times New Roman"/>
+          <w:sz w:val="22"/>
+        </w:rPr>
+        <w:t xml:space="preserve"/>
+      </w:r>
+    </w:p>
+    <w:p>
+      <w:r>
+        <w:rPr>
+          <w:rFonts w:ascii="Times New Roman" w:hAnsi="Times New Roman"/>
+          <w:sz w:val="22"/>
+        </w:rPr>
+        <w:t xml:space="preserve">In accordance with the editor's instructions, we have embedded all figures from the outputs/figures directory into the revised manuscript. The main text retains the original 6 figures (Figures 1-6) with their existing captions. Additionally, 12 supplementary figures (Figures S1-S12) have been added in a new 'Supplementary Figures' section before the References. Each supplementary figure includes:</w:t>
+      </w:r>
+    </w:p>
+    <w:p>
+      <w:r>
+        <w:rPr>
+          <w:rFonts w:ascii="Times New Roman" w:hAnsi="Times New Roman"/>
+          <w:sz w:val="22"/>
+        </w:rPr>
+        <w:t xml:space="preserve">• A publication-quality descriptive caption explaining the figure content, axes, variables, and key takeaways</w:t>
+      </w:r>
+    </w:p>
+    <w:p>
+      <w:r>
+        <w:rPr>
+          <w:rFonts w:ascii="Times New Roman" w:hAnsi="Times New Roman"/>
+          <w:sz w:val="22"/>
+        </w:rPr>
+        <w:t xml:space="preserve">• In-text citations at the point where each figure is first discussed (formatted as 'see Figure SX')</w:t>
+      </w:r>
+    </w:p>
+    <w:p>
+      <w:r>
+        <w:rPr>
+          <w:rFonts w:ascii="Times New Roman" w:hAnsi="Times New Roman"/>
+          <w:sz w:val="22"/>
+        </w:rPr>
+        <w:t xml:space="preserve">• Sequential numbering (S1-S12) following the main text figures</w:t>
+      </w:r>
+    </w:p>
+    <w:p>
+      <w:r>
+        <w:rPr>
+          <w:rFonts w:ascii="Times New Roman" w:hAnsi="Times New Roman"/>
+          <w:sz w:val="22"/>
+        </w:rPr>
+        <w:t xml:space="preserve"/>
+      </w:r>
+    </w:p>
+    <w:p>
+      <w:r>
+        <w:rPr>
+          <w:rFonts w:ascii="Times New Roman" w:hAnsi="Times New Roman"/>
+          <w:sz w:val="22"/>
+        </w:rPr>
+        <w:t xml:space="preserve">The supplementary figures provide:</w:t>
+      </w:r>
+    </w:p>
+    <w:p>
+      <w:r>
+        <w:rPr>
+          <w:rFonts w:ascii="Times New Roman" w:hAnsi="Times New Roman"/>
+          <w:sz w:val="22"/>
+        </w:rPr>
+        <w:t xml:space="preserve">  Figure S1: System boundary definitions (supports Methodology section)</w:t>
+      </w:r>
+    </w:p>
+    <w:p>
+      <w:r>
+        <w:rPr>
+          <w:rFonts w:ascii="Times New Roman" w:hAnsi="Times New Roman"/>
+          <w:sz w:val="22"/>
+        </w:rPr>
+        <w:t xml:space="preserve">  Figure S2: Harmonization framework flowchart (supports Framework Development section)</w:t>
+      </w:r>
+    </w:p>
+    <w:p>
+      <w:r>
+        <w:rPr>
+          <w:rFonts w:ascii="Times New Roman" w:hAnsi="Times New Roman"/>
+          <w:sz w:val="22"/>
+        </w:rPr>
+        <w:t xml:space="preserve">  Figure S3: Detailed cost component breakdown (supports TEA Results section)</w:t>
+      </w:r>
+    </w:p>
+    <w:p>
+      <w:r>
+        <w:rPr>
+          <w:rFonts w:ascii="Times New Roman" w:hAnsi="Times New Roman"/>
+          <w:sz w:val="22"/>
+        </w:rPr>
+        <w:t xml:space="preserve">  Figure S4: Tornado sensitivity diagram (supports Sensitivity Analysis section)</w:t>
+      </w:r>
+    </w:p>
+    <w:p>
+      <w:r>
+        <w:rPr>
+          <w:rFonts w:ascii="Times New Roman" w:hAnsi="Times New Roman"/>
+          <w:sz w:val="22"/>
+        </w:rPr>
+        <w:t xml:space="preserve">  Figure S5: Monte Carlo simulation overlay (supports Framework Validation section)</w:t>
+      </w:r>
+    </w:p>
+    <w:p>
+      <w:r>
+        <w:rPr>
+          <w:rFonts w:ascii="Times New Roman" w:hAnsi="Times New Roman"/>
+          <w:sz w:val="22"/>
+        </w:rPr>
+        <w:t xml:space="preserve">  Figure S6: Cross-pathway GHG comparison (supports LCA Results section)</w:t>
+      </w:r>
+    </w:p>
+    <w:p>
+      <w:r>
+        <w:rPr>
+          <w:rFonts w:ascii="Times New Roman" w:hAnsi="Times New Roman"/>
+          <w:sz w:val="22"/>
+        </w:rPr>
+        <w:t xml:space="preserve">  Figure S7: GHG emission source contributions (supports LCA Results section)</w:t>
+      </w:r>
+    </w:p>
+    <w:p>
+      <w:r>
+        <w:rPr>
+          <w:rFonts w:ascii="Times New Roman" w:hAnsi="Times New Roman"/>
+          <w:sz w:val="22"/>
+        </w:rPr>
+        <w:t xml:space="preserve">  Figure S8: Parameter interaction heatmap (supports Results section)</w:t>
+      </w:r>
+    </w:p>
+    <w:p>
+      <w:r>
+        <w:rPr>
+          <w:rFonts w:ascii="Times New Roman" w:hAnsi="Times New Roman"/>
+          <w:sz w:val="22"/>
+        </w:rPr>
+        <w:t xml:space="preserve">  Figure S9: Extended variance decomposition (supports Framework Validation section)</w:t>
+      </w:r>
+    </w:p>
+    <w:p>
+      <w:r>
+        <w:rPr>
+          <w:rFonts w:ascii="Times New Roman" w:hAnsi="Times New Roman"/>
+          <w:sz w:val="22"/>
+        </w:rPr>
+        <w:t xml:space="preserve">  Figure S10: TEA-LCA scatter plot (supports Discussion section)</w:t>
+      </w:r>
+    </w:p>
+    <w:p>
+      <w:r>
+        <w:rPr>
+          <w:rFonts w:ascii="Times New Roman" w:hAnsi="Times New Roman"/>
+          <w:sz w:val="22"/>
+        </w:rPr>
+        <w:t xml:space="preserve">  Figure S11: Sensitivity radar plot (supports Discussion section)</w:t>
+      </w:r>
+    </w:p>
+    <w:p>
+      <w:r>
+        <w:rPr>
+          <w:rFonts w:ascii="Times New Roman" w:hAnsi="Times New Roman"/>
+          <w:sz w:val="22"/>
+        </w:rPr>
+        <w:t xml:space="preserve">  Figure S12: Pareto-ranked cumulative sensitivity (supports Discussion section)</w:t>
+      </w:r>
+    </w:p>
+    <w:p>
+      <w:r>
+        <w:rPr>
+          <w:rFonts w:ascii="Times New Roman" w:hAnsi="Times New Roman"/>
+          <w:sz w:val="22"/>
+        </w:rPr>
+        <w:t xml:space="preserve"/>
+      </w:r>
+    </w:p>
+    <w:p>
+      <w:r>
+        <w:rPr>
+          <w:rFonts w:ascii="Times New Roman" w:hAnsi="Times New Roman"/>
+          <w:sz w:val="22"/>
+        </w:rPr>
+        <w:t xml:space="preserve">All figures maintain consistent formatting with the manuscript's academic tone and citation style. The supplementary figures strengthen the manuscript by providing visual evidence for claims made in the text and enabling readers to independently assess the computational modeling results.</w:t>
       </w:r>
     </w:p>
     <w:sectPr>

</xml_diff>